<commit_message>
docs(informe): agregar explicacion a cada evidencia de los anexos
</commit_message>
<xml_diff>
--- a/Entrega_Parcial2/Informe_Tecnico_MiPatita.docx
+++ b/Entrega_Parcial2/Informe_Tecnico_MiPatita.docx
@@ -3242,7 +3242,7 @@
           <wp:inline distT="0" distB="0" distL="0" distR="0">
             <wp:extent cx="4381500" cy="2638425"/>
             <wp:effectExtent t="0" r="0" b="0" l="0"/>
-            <wp:docPr id="1" name="Anexo 1. Dependencias del proyecto" descr="Anexo 1. Dependencias del proyecto" title="Anexo 1. Dependencias del proyecto"/>
+            <wp:docPr id="1" name="Anexo 1. Creación del proyecto y dependencias (Spring Initializr)" descr="Anexo 1. Creación del proyecto y dependencias (Spring Initializr)" title="Anexo 1. Creación del proyecto y dependencias (Spring Initializr)"/>
             <wp:cNvGraphicFramePr>
               <a:graphicFrameLocks xmlns:a="http://schemas.openxmlformats.org/drawingml/2006/main" noChangeAspect="1"/>
             </wp:cNvGraphicFramePr>
@@ -3291,7 +3291,20 @@
           <w:sz w:val="18"/>
           <w:szCs w:val="18"/>
         </w:rPr>
-        <w:t xml:space="preserve">Anexo 1. Dependencias del proyecto</w:t>
+        <w:t xml:space="preserve">Anexo 1. Creación del proyecto y dependencias (Spring Initializr)</w:t>
+      </w:r>
+    </w:p>
+    <w:p>
+      <w:pPr>
+        <w:spacing w:after="140" w:line="276"/>
+        <w:jc w:val="both"/>
+      </w:pPr>
+      <w:r>
+        <w:rPr>
+          <w:sz w:val="22"/>
+          <w:szCs w:val="22"/>
+        </w:rPr>
+        <w:t xml:space="preserve">La imagen muestra la creación del proyecto en Spring Initializr (Maven, Java 21, Spring Boot). Se incorporaron todas las dependencias clave del sistema: Spring Web (API REST), Spring Security (seguridad), Flyway Migration (migraciones versionadas de la base de datos), OpenFeign (comunicación entre microservicios), Spring Data JPA (persistencia con ORM), SQLite Driver (base de datos), Lombok (reduce código repetitivo) y Validation (Bean Validation). Evidencia que el proyecto se construyó sobre el stack tecnológico exigido.</w:t>
       </w:r>
     </w:p>
     <w:p>
@@ -3304,7 +3317,7 @@
           <wp:inline distT="0" distB="0" distL="0" distR="0">
             <wp:extent cx="4381500" cy="1381125"/>
             <wp:effectExtent t="0" r="0" b="0" l="0"/>
-            <wp:docPr id="1" name="Anexo 2. Creación de mascota reflejada en la base de datos" descr="Anexo 2. Creación de mascota reflejada en la base de datos" title="Anexo 2. Creación de mascota reflejada en la base de datos"/>
+            <wp:docPr id="1" name="Anexo 2. Mascotas persistidas en la base de datos del microservicio (mascotas.db)" descr="Anexo 2. Mascotas persistidas en la base de datos del microservicio (mascotas.db)" title="Anexo 2. Mascotas persistidas en la base de datos del microservicio (mascotas.db)"/>
             <wp:cNvGraphicFramePr>
               <a:graphicFrameLocks xmlns:a="http://schemas.openxmlformats.org/drawingml/2006/main" noChangeAspect="1"/>
             </wp:cNvGraphicFramePr>
@@ -3353,7 +3366,20 @@
           <w:sz w:val="18"/>
           <w:szCs w:val="18"/>
         </w:rPr>
-        <w:t xml:space="preserve">Anexo 2. Creación de mascota reflejada en la base de datos</w:t>
+        <w:t xml:space="preserve">Anexo 2. Mascotas persistidas en la base de datos del microservicio (mascotas.db)</w:t>
+      </w:r>
+    </w:p>
+    <w:p>
+      <w:pPr>
+        <w:spacing w:after="140" w:line="276"/>
+        <w:jc w:val="both"/>
+      </w:pPr>
+      <w:r>
+        <w:rPr>
+          <w:sz w:val="22"/>
+          <w:szCs w:val="22"/>
+        </w:rPr>
+        <w:t xml:space="preserve">Corresponde a la base de datos del microservicio de Mascotas (mascotas.db) abierta en un visor SQLite. En la tabla 'mascotas' se observan 6 registros: las 5 mascotas de ejemplo más la mascota con id 6 ('Raton'), creada a través de la API y persistida correctamente. También aparece la tabla 'flyway_schema_history', lo que confirma que las tablas fueron creadas por Flyway y no por Hibernate. Evidencia la persistencia con JPA y el uso de migraciones versionadas.</w:t>
       </w:r>
     </w:p>
     <w:p>
@@ -3366,7 +3392,7 @@
           <wp:inline distT="0" distB="0" distL="0" distR="0">
             <wp:extent cx="4381500" cy="781050"/>
             <wp:effectExtent t="0" r="0" b="0" l="0"/>
-            <wp:docPr id="1" name="Anexo 3. Aislamiento de usuarios en su propia base de datos" descr="Anexo 3. Aislamiento de usuarios en su propia base de datos" title="Anexo 3. Aislamiento de usuarios en su propia base de datos"/>
+            <wp:docPr id="1" name="Anexo 3. Base de datos independiente de MiPatita y contraseña cifrada con BCrypt" descr="Anexo 3. Base de datos independiente de MiPatita y contraseña cifrada con BCrypt" title="Anexo 3. Base de datos independiente de MiPatita y contraseña cifrada con BCrypt"/>
             <wp:cNvGraphicFramePr>
               <a:graphicFrameLocks xmlns:a="http://schemas.openxmlformats.org/drawingml/2006/main" noChangeAspect="1"/>
             </wp:cNvGraphicFramePr>
@@ -3415,7 +3441,20 @@
           <w:sz w:val="18"/>
           <w:szCs w:val="18"/>
         </w:rPr>
-        <w:t xml:space="preserve">Anexo 3. Aislamiento de usuarios en su propia base de datos</w:t>
+        <w:t xml:space="preserve">Anexo 3. Base de datos independiente de MiPatita y contraseña cifrada con BCrypt</w:t>
+      </w:r>
+    </w:p>
+    <w:p>
+      <w:pPr>
+        <w:spacing w:after="140" w:line="276"/>
+        <w:jc w:val="both"/>
+      </w:pPr>
+      <w:r>
+        <w:rPr>
+          <w:sz w:val="22"/>
+          <w:szCs w:val="22"/>
+        </w:rPr>
+        <w:t xml:space="preserve">Corresponde a la base de datos del servicio MiPatita (mipatita.db), distinta e independiente de la de Mascotas. En la tabla 'usuarios' se ve el usuario registrado, y la contraseña NO está en texto plano: está cifrada con BCrypt (el hash comienza con '$2a$10$...'). También se aprecian las tablas propias de MiPatita: usuarios, actividades y recordatorios. Evidencia dos cosas: el principio de 'una base de datos por microservicio' (MiPatita tiene su propia base, separada de mascotas.db) y el cifrado de contraseñas.</w:t>
       </w:r>
     </w:p>
     <w:p>
@@ -3428,7 +3467,7 @@
           <wp:inline distT="0" distB="0" distL="0" distR="0">
             <wp:extent cx="4381500" cy="2047875"/>
             <wp:effectExtent t="0" r="0" b="0" l="0"/>
-            <wp:docPr id="1" name="Anexo 4. Registro de usuario en Postman" descr="Anexo 4. Registro de usuario en Postman" title="Anexo 4. Registro de usuario en Postman"/>
+            <wp:docPr id="1" name="Anexo 4. Registro de usuario en Postman (POST /auth/registro)" descr="Anexo 4. Registro de usuario en Postman (POST /auth/registro)" title="Anexo 4. Registro de usuario en Postman (POST /auth/registro)"/>
             <wp:cNvGraphicFramePr>
               <a:graphicFrameLocks xmlns:a="http://schemas.openxmlformats.org/drawingml/2006/main" noChangeAspect="1"/>
             </wp:cNvGraphicFramePr>
@@ -3477,7 +3516,20 @@
           <w:sz w:val="18"/>
           <w:szCs w:val="18"/>
         </w:rPr>
-        <w:t xml:space="preserve">Anexo 4. Registro de usuario en Postman</w:t>
+        <w:t xml:space="preserve">Anexo 4. Registro de usuario en Postman (POST /auth/registro)</w:t>
+      </w:r>
+    </w:p>
+    <w:p>
+      <w:pPr>
+        <w:spacing w:after="140" w:line="276"/>
+        <w:jc w:val="both"/>
+      </w:pPr>
+      <w:r>
+        <w:rPr>
+          <w:sz w:val="22"/>
+          <w:szCs w:val="22"/>
+        </w:rPr>
+        <w:t xml:space="preserve">Muestra una petición POST al endpoint /api/v1/auth/registro desde Postman, enviando en el cuerpo (Body, en formato JSON) el username, la password y el role del nuevo usuario. La respuesta '200 OK' con el mensaje 'Usuario registrado exitosamente' evidencia que el endpoint de registro funciona y crea el usuario (cuya contraseña queda cifrada, como se ve en el Anexo 3).</w:t>
       </w:r>
     </w:p>
     <w:p>
@@ -3490,7 +3542,7 @@
           <wp:inline distT="0" distB="0" distL="0" distR="0">
             <wp:extent cx="4381500" cy="2238375"/>
             <wp:effectExtent t="0" r="0" b="0" l="0"/>
-            <wp:docPr id="1" name="Anexo 5. Token JWT generado en Postman" descr="Anexo 5. Token JWT generado en Postman" title="Anexo 5. Token JWT generado en Postman"/>
+            <wp:docPr id="1" name="Anexo 5. Login y generación de token JWT en Postman (POST /auth/login)" descr="Anexo 5. Login y generación de token JWT en Postman (POST /auth/login)" title="Anexo 5. Login y generación de token JWT en Postman (POST /auth/login)"/>
             <wp:cNvGraphicFramePr>
               <a:graphicFrameLocks xmlns:a="http://schemas.openxmlformats.org/drawingml/2006/main" noChangeAspect="1"/>
             </wp:cNvGraphicFramePr>
@@ -3539,7 +3591,20 @@
           <w:sz w:val="18"/>
           <w:szCs w:val="18"/>
         </w:rPr>
-        <w:t xml:space="preserve">Anexo 5. Token JWT generado en Postman</w:t>
+        <w:t xml:space="preserve">Anexo 5. Login y generación de token JWT en Postman (POST /auth/login)</w:t>
+      </w:r>
+    </w:p>
+    <w:p>
+      <w:pPr>
+        <w:spacing w:after="140" w:line="276"/>
+        <w:jc w:val="both"/>
+      </w:pPr>
+      <w:r>
+        <w:rPr>
+          <w:sz w:val="22"/>
+          <w:szCs w:val="22"/>
+        </w:rPr>
+        <w:t xml:space="preserve">Muestra una petición POST al endpoint /api/v1/auth/login con las credenciales del usuario. La respuesta '200 OK' devuelve un token JWT (campo 'token' con la cadena 'eyJhbGci...'). Ese token es el que el cliente debe enviar en la cabecera Authorization en las siguientes peticiones para acceder a las rutas protegidas. Evidencia la seguridad stateless mediante JWT: el servidor no guarda sesión, sino que entrega un token firmado.</w:t>
       </w:r>
     </w:p>
     <w:p>

</xml_diff>